<commit_message>
Chapter 9 goes to the editors after Ion Boldea declines
Boldea declined Ilya's invitation. His own experiments stop at 12 000
r/min, and he suggested Francesco Cupertino (Bari) and Chris Gerada
(Nottingham), asking that Juha write to them. The editors will write
Chapter 9 themselves, with Ilya leading the rotor losses. The working
table of contents now names the authors for Chapter 9 in all three
places, with no trace of Rasilo. The windage section is offered to Juha
Saari, and the contributors' copy is regenerated.

The notes record what follows. Anouar's signed letter names both loss
chapters, so he must be told, and either the sentence changes or his
group writes the materials sections. Saari was promised on 22 September
that he would hear who owns Chapter 9. Boldea's two names fit Chapter
14's aerospace section, or the list of suggested reviewers.

Co-Authored-By: Claude Opus 5.5 <noreply@anthropic.com>
Claude-Session: https://claude.ai/code/session_01YTsySEafbpGxYLQMAGUGjT
</commit_message>
<xml_diff>
--- a/chapter1/Annotated_TOC.docx
+++ b/chapter1/Annotated_TOC.docx
@@ -1461,7 +1461,7 @@
               <w:rPr>
                 <w:sz w:val="19"/>
               </w:rPr>
-              <w:t>P. Rasilo</w:t>
+              <w:t>authors</w:t>
             </w:r>
           </w:p>
         </w:tc>
@@ -2815,7 +2815,7 @@
         <w:jc w:val="both"/>
       </w:pPr>
       <w:r>
-        <w:t>Budget: 30 pages, 20 figures, 3 tables. Owner: A. Belahcen (loss modelling, materials, manufacturing effects), with I. Petrov on the rotor losses and a co-author of his choosing for the windage of §9.8; J. Saari, whose correlations the section rests on, is the natural name for it. DREM boundary: the earlier book's loss chapters cover the conventional frequency range; only the high-speed departures are treated.</w:t>
+        <w:t>Budget: 30 pages, 20 figures, 3 tables. Owner: the authors, with I. Petrov leading the rotor losses of §9.5 to §9.7; the windage of §9.8 is offered to J. Saari, whose correlations the section rests on. DREM boundary: the earlier book's loss chapters cover the conventional frequency range; only the high-speed departures are treated.</w:t>
       </w:r>
     </w:p>
     <w:p>
@@ -3515,7 +3515,7 @@
               <w:rPr>
                 <w:sz w:val="19"/>
               </w:rPr>
-              <w:t>9 — Core, rotor and aerodynamic losses</w:t>
+              <w:t>10 — Thermal management and cooling</w:t>
             </w:r>
           </w:p>
         </w:tc>
@@ -3533,7 +3533,7 @@
               <w:rPr>
                 <w:sz w:val="19"/>
               </w:rPr>
-              <w:t>Paavo Rasilo</w:t>
+              <w:t>Rafal Wrobel</w:t>
             </w:r>
           </w:p>
         </w:tc>
@@ -3551,7 +3551,7 @@
               <w:rPr>
                 <w:sz w:val="19"/>
               </w:rPr>
-              <w:t>Tampere University</w:t>
+              <w:t>independent researcher and engineering consultant</w:t>
             </w:r>
           </w:p>
         </w:tc>
@@ -3569,7 +3569,7 @@
               <w:rPr>
                 <w:sz w:val="19"/>
               </w:rPr>
-              <w:t>declined 20 Sep; owner to be settled</w:t>
+              <w:t>accepted; letter received, to be signed</w:t>
             </w:r>
           </w:p>
         </w:tc>
@@ -3589,7 +3589,7 @@
               <w:rPr>
                 <w:sz w:val="19"/>
               </w:rPr>
-              <w:t>10 — Thermal management and cooling</w:t>
+              <w:t>11 — The drive: the converter interface</w:t>
             </w:r>
           </w:p>
         </w:tc>
@@ -3607,7 +3607,7 @@
               <w:rPr>
                 <w:sz w:val="19"/>
               </w:rPr>
-              <w:t>Rafal Wrobel</w:t>
+              <w:t>Pasi Peltoniemi</w:t>
             </w:r>
           </w:p>
         </w:tc>
@@ -3625,7 +3625,7 @@
               <w:rPr>
                 <w:sz w:val="19"/>
               </w:rPr>
-              <w:t>independent researcher and engineering consultant</w:t>
+              <w:t>LUT, power electronics</w:t>
             </w:r>
           </w:p>
         </w:tc>
@@ -3643,7 +3643,7 @@
               <w:rPr>
                 <w:sz w:val="19"/>
               </w:rPr>
-              <w:t>accepted; letter received, to be signed</w:t>
+              <w:t>accepted; letter received</w:t>
             </w:r>
           </w:p>
         </w:tc>
@@ -3663,7 +3663,7 @@
               <w:rPr>
                 <w:sz w:val="19"/>
               </w:rPr>
-              <w:t>11 — The drive: the converter interface</w:t>
+              <w:t>12 — Control at high fundamental frequency</w:t>
             </w:r>
           </w:p>
         </w:tc>
@@ -3681,7 +3681,7 @@
               <w:rPr>
                 <w:sz w:val="19"/>
               </w:rPr>
-              <w:t>Pasi Peltoniemi</w:t>
+              <w:t>Marko Hinkkanen</w:t>
             </w:r>
           </w:p>
         </w:tc>
@@ -3699,7 +3699,7 @@
               <w:rPr>
                 <w:sz w:val="19"/>
               </w:rPr>
-              <w:t>LUT, power electronics</w:t>
+              <w:t>Aalto University, electric drives</w:t>
             </w:r>
           </w:p>
         </w:tc>
@@ -3717,7 +3717,7 @@
               <w:rPr>
                 <w:sz w:val="19"/>
               </w:rPr>
-              <w:t>accepted; letter received</w:t>
+              <w:t>interested but not committed (8 Sep); has the draft letter</w:t>
             </w:r>
           </w:p>
         </w:tc>
@@ -3737,7 +3737,7 @@
               <w:rPr>
                 <w:sz w:val="19"/>
               </w:rPr>
-              <w:t>12 — Control at high fundamental frequency</w:t>
+              <w:t>13 — Industrial case studies</w:t>
             </w:r>
           </w:p>
         </w:tc>
@@ -3755,7 +3755,7 @@
               <w:rPr>
                 <w:sz w:val="19"/>
               </w:rPr>
-              <w:t>Marko Hinkkanen</w:t>
+              <w:t>Jonna Tiainen and Ahti Jaatinen-Värri</w:t>
             </w:r>
           </w:p>
         </w:tc>
@@ -3773,7 +3773,7 @@
               <w:rPr>
                 <w:sz w:val="19"/>
               </w:rPr>
-              <w:t>Aalto University, electric drives</w:t>
+              <w:t>The Switch; LUT, turbomachinery</w:t>
             </w:r>
           </w:p>
         </w:tc>
@@ -3791,7 +3791,7 @@
               <w:rPr>
                 <w:sz w:val="19"/>
               </w:rPr>
-              <w:t>interested but not committed (8 Sep); has the draft letter</w:t>
+              <w:t>invited; no answer recorded</w:t>
             </w:r>
           </w:p>
         </w:tc>
@@ -3811,7 +3811,7 @@
               <w:rPr>
                 <w:sz w:val="19"/>
               </w:rPr>
-              <w:t>13 — Industrial case studies</w:t>
+              <w:t>14 — Mobile case studies</w:t>
             </w:r>
           </w:p>
         </w:tc>
@@ -3829,7 +3829,7 @@
               <w:rPr>
                 <w:sz w:val="19"/>
               </w:rPr>
-              <w:t>Jonna Tiainen and Ahti Jaatinen-Värri</w:t>
+              <w:t>Jenni Pippuri-Mäkeläinen</w:t>
             </w:r>
           </w:p>
         </w:tc>
@@ -3847,7 +3847,7 @@
               <w:rPr>
                 <w:sz w:val="19"/>
               </w:rPr>
-              <w:t>The Switch; LUT, turbomachinery</w:t>
+              <w:t>VTT, manager of the Voltcar project</w:t>
             </w:r>
           </w:p>
         </w:tc>
@@ -3885,81 +3885,7 @@
               <w:rPr>
                 <w:sz w:val="19"/>
               </w:rPr>
-              <w:t>14 — Mobile case studies</w:t>
-            </w:r>
-          </w:p>
-        </w:tc>
-        <w:tc>
-          <w:tcPr>
-            <w:tcW w:type="dxa" w:w="2160"/>
-          </w:tcPr>
-          <w:p>
-            <w:r>
-              <w:rPr>
-                <w:sz w:val="19"/>
-              </w:rPr>
-            </w:r>
-            <w:r>
-              <w:rPr>
-                <w:sz w:val="19"/>
-              </w:rPr>
-              <w:t>Jenni Pippuri-Mäkeläinen</w:t>
-            </w:r>
-          </w:p>
-        </w:tc>
-        <w:tc>
-          <w:tcPr>
-            <w:tcW w:type="dxa" w:w="2160"/>
-          </w:tcPr>
-          <w:p>
-            <w:r>
-              <w:rPr>
-                <w:sz w:val="19"/>
-              </w:rPr>
-            </w:r>
-            <w:r>
-              <w:rPr>
-                <w:sz w:val="19"/>
-              </w:rPr>
-              <w:t>VTT, manager of the Voltcar project</w:t>
-            </w:r>
-          </w:p>
-        </w:tc>
-        <w:tc>
-          <w:tcPr>
-            <w:tcW w:type="dxa" w:w="2160"/>
-          </w:tcPr>
-          <w:p>
-            <w:r>
-              <w:rPr>
-                <w:sz w:val="19"/>
-              </w:rPr>
-            </w:r>
-            <w:r>
-              <w:rPr>
-                <w:sz w:val="19"/>
-              </w:rPr>
-              <w:t>invited; no answer recorded</w:t>
-            </w:r>
-          </w:p>
-        </w:tc>
-      </w:tr>
-      <w:tr>
-        <w:tc>
-          <w:tcPr>
-            <w:tcW w:type="dxa" w:w="2160"/>
-          </w:tcPr>
-          <w:p>
-            <w:r>
-              <w:rPr>
-                <w:sz w:val="19"/>
-              </w:rPr>
-            </w:r>
-            <w:r>
-              <w:rPr>
-                <w:sz w:val="19"/>
-              </w:rPr>
-              <w:t>1, 3, 7</w:t>
+              <w:t>1, 3, 7, 9</w:t>
             </w:r>
           </w:p>
         </w:tc>
@@ -4441,7 +4367,7 @@
               <w:rPr>
                 <w:sz w:val="19"/>
               </w:rPr>
-              <w:t>a windage co-author</w:t>
+              <w:t>Juha Saari</w:t>
             </w:r>
           </w:p>
         </w:tc>
@@ -4459,7 +4385,7 @@
               <w:rPr>
                 <w:sz w:val="19"/>
               </w:rPr>
-              <w:t>to be settled</w:t>
+              <w:t>Upheat Solutions</w:t>
             </w:r>
           </w:p>
         </w:tc>
@@ -4477,7 +4403,7 @@
               <w:rPr>
                 <w:sz w:val="19"/>
               </w:rPr>
-              <w:t>9, §9.8</w:t>
+              <w:t>9, §9.8, aerodynamic and windage losses</w:t>
             </w:r>
           </w:p>
         </w:tc>
@@ -4495,7 +4421,7 @@
               <w:rPr>
                 <w:sz w:val="19"/>
               </w:rPr>
-              <w:t>P. Rasilo; J. Saari is the natural name</w:t>
+              <w:t>the authors; to be offered</w:t>
             </w:r>
           </w:p>
         </w:tc>

</xml_diff>

<commit_message>
Record the emails to Marko, Jussi and Jenni as sent; Chapter 13 letters wait on §1.1.2
The reply to Marko and the reminders to Jussi and Jenni went out on 26
October. All three ask for the letter by Friday 6 November.

Ahti's and Jonna's letters will be asked for together once Ahti has
finished §1.1.2, his specific-speed section of Chapter 1. The Chapter 13
email they hold dates from September, so a note under it lists what the
request must bring up to date: §13.3 was offered to Jonna but Ikäheimo's
signed letter takes it, §13.5 is Ikäheimo's rather than Lassi's, and
Ahti's draft letter does not yet mention §1.1.2.

The status column of the internal table of contents follows. The
circulation copy is unchanged, since it carries no status.

Co-Authored-By: Claude Opus 5.5 <noreply@anthropic.com>
Claude-Session: https://claude.ai/code/session_01YTsySEafbpGxYLQMAGUGjT
</commit_message>
<xml_diff>
--- a/chapter1/Annotated_TOC.docx
+++ b/chapter1/Annotated_TOC.docx
@@ -3273,7 +3273,7 @@
               <w:rPr>
                 <w:sz w:val="19"/>
               </w:rPr>
-              <w:t>drafted</w:t>
+              <w:t>drafted; Ahti is completing it (26 Oct)</w:t>
             </w:r>
           </w:p>
         </w:tc>
@@ -3421,7 +3421,7 @@
               <w:rPr>
                 <w:sz w:val="19"/>
               </w:rPr>
-              <w:t>interested (9 Sep); scope questions open; letter promised</w:t>
+              <w:t>interested (9 Sep); scope suggestion sent 26 Oct; letter promised, asked for by 6 Nov</w:t>
             </w:r>
           </w:p>
         </w:tc>
@@ -3717,7 +3717,7 @@
               <w:rPr>
                 <w:sz w:val="19"/>
               </w:rPr>
-              <w:t>accepted (25 Oct), with a postdoc from his group; letter promised</w:t>
+              <w:t>accepted (25 Oct), with a postdoc from his group; letter promised, asked for by 6 Nov</w:t>
             </w:r>
           </w:p>
         </w:tc>
@@ -3791,7 +3791,7 @@
               <w:rPr>
                 <w:sz w:val="19"/>
               </w:rPr>
-              <w:t>invited; no answer recorded</w:t>
+              <w:t>invited; letters to be asked for once §1.1.2 is finished</w:t>
             </w:r>
           </w:p>
         </w:tc>
@@ -3865,7 +3865,7 @@
               <w:rPr>
                 <w:sz w:val="19"/>
               </w:rPr>
-              <w:t>invited; no answer recorded</w:t>
+              <w:t>invited; no answer; reminded 26 Oct, letter asked for by 6 Nov</w:t>
             </w:r>
           </w:p>
         </w:tc>

</xml_diff>